<commit_message>
add: hacking etico resumen
</commit_message>
<xml_diff>
--- a/plantilla_CETI_UT02.docx
+++ b/plantilla_CETI_UT02.docx
@@ -397,13 +397,7 @@
               <w:rPr>
                 <w:sz w:val="20"/>
               </w:rPr>
-              <w:t>[</w:t>
-            </w:r>
-            <w:r>
-              <w:rPr>
-                <w:sz w:val="20"/>
-              </w:rPr>
-              <w:t xml:space="preserve">  </w:t>
+              <w:t xml:space="preserve">[  </w:t>
             </w:r>
             <w:r>
               <w:rPr>
@@ -445,21 +439,16 @@
               <w:ind w:right="1"/>
               <w:rPr>
                 <w:sz w:val="20"/>
+                <w:u w:val="single"/>
               </w:rPr>
             </w:pPr>
             <w:r>
               <w:rPr>
                 <w:spacing w:val="-4"/>
                 <w:sz w:val="20"/>
-              </w:rPr>
-              <w:t>UTO</w:t>
-            </w:r>
-            <w:r>
-              <w:rPr>
-                <w:spacing w:val="-4"/>
-                <w:sz w:val="20"/>
-              </w:rPr>
-              <w:t>1</w:t>
+                <w:u w:val="single"/>
+              </w:rPr>
+              <w:t>UTO2</w:t>
             </w:r>
           </w:p>
         </w:tc>
@@ -479,37 +468,7 @@
               <w:rPr>
                 <w:sz w:val="20"/>
               </w:rPr>
-              <w:t>1</w:t>
-            </w:r>
-            <w:r>
-              <w:rPr>
-                <w:sz w:val="20"/>
-              </w:rPr>
-              <w:t>8</w:t>
-            </w:r>
-            <w:r>
-              <w:rPr>
-                <w:sz w:val="20"/>
-              </w:rPr>
-              <w:t>/</w:t>
-            </w:r>
-            <w:r>
-              <w:rPr>
-                <w:sz w:val="20"/>
-              </w:rPr>
-              <w:t>01</w:t>
-            </w:r>
-            <w:r>
-              <w:rPr>
-                <w:sz w:val="20"/>
-              </w:rPr>
-              <w:t>/2</w:t>
-            </w:r>
-            <w:r>
-              <w:rPr>
-                <w:sz w:val="20"/>
-              </w:rPr>
-              <w:t>6</w:t>
+              <w:t>18/01/26</w:t>
             </w:r>
           </w:p>
         </w:tc>
@@ -577,14 +536,16 @@
               <w:ind w:right="1"/>
               <w:rPr>
                 <w:sz w:val="20"/>
+                <w:u w:val="single"/>
               </w:rPr>
             </w:pPr>
             <w:r>
               <w:rPr>
                 <w:spacing w:val="-4"/>
                 <w:sz w:val="20"/>
-              </w:rPr>
-              <w:t>UTO1</w:t>
+                <w:u w:val="single"/>
+              </w:rPr>
+              <w:t>UTO2</w:t>
             </w:r>
           </w:p>
         </w:tc>
@@ -604,13 +565,7 @@
               <w:rPr>
                 <w:sz w:val="20"/>
               </w:rPr>
-              <w:t>16</w:t>
-            </w:r>
-            <w:r>
-              <w:rPr>
-                <w:sz w:val="20"/>
-              </w:rPr>
-              <w:t>/11/25</w:t>
+              <w:t>16/11/25</w:t>
             </w:r>
           </w:p>
         </w:tc>
@@ -678,14 +633,16 @@
               <w:ind w:right="1"/>
               <w:rPr>
                 <w:sz w:val="20"/>
+                <w:u w:val="single"/>
               </w:rPr>
             </w:pPr>
             <w:r>
               <w:rPr>
                 <w:spacing w:val="-4"/>
                 <w:sz w:val="20"/>
-              </w:rPr>
-              <w:t>UTO1</w:t>
+                <w:u w:val="single"/>
+              </w:rPr>
+              <w:t>UTO2</w:t>
             </w:r>
           </w:p>
         </w:tc>
@@ -705,31 +662,7 @@
               <w:rPr>
                 <w:sz w:val="20"/>
               </w:rPr>
-              <w:t>2</w:t>
-            </w:r>
-            <w:r>
-              <w:rPr>
-                <w:sz w:val="20"/>
-              </w:rPr>
-              <w:t>2</w:t>
-            </w:r>
-            <w:r>
-              <w:rPr>
-                <w:sz w:val="20"/>
-              </w:rPr>
-              <w:t>/1</w:t>
-            </w:r>
-            <w:r>
-              <w:rPr>
-                <w:sz w:val="20"/>
-              </w:rPr>
-              <w:t>2</w:t>
-            </w:r>
-            <w:r>
-              <w:rPr>
-                <w:sz w:val="20"/>
-              </w:rPr>
-              <w:t>/25</w:t>
+              <w:t>22/12/25</w:t>
             </w:r>
           </w:p>
         </w:tc>
@@ -798,14 +731,16 @@
               <w:ind w:right="1"/>
               <w:rPr>
                 <w:sz w:val="20"/>
+                <w:u w:val="single"/>
               </w:rPr>
             </w:pPr>
             <w:r>
               <w:rPr>
                 <w:spacing w:val="-4"/>
                 <w:sz w:val="20"/>
-              </w:rPr>
-              <w:t>UTO1</w:t>
+                <w:u w:val="single"/>
+              </w:rPr>
+              <w:t>UTO2</w:t>
             </w:r>
           </w:p>
         </w:tc>
@@ -825,25 +760,7 @@
               <w:rPr>
                 <w:sz w:val="20"/>
               </w:rPr>
-              <w:t>15</w:t>
-            </w:r>
-            <w:r>
-              <w:rPr>
-                <w:sz w:val="20"/>
-              </w:rPr>
-              <w:t>/1</w:t>
-            </w:r>
-            <w:r>
-              <w:rPr>
-                <w:sz w:val="20"/>
-              </w:rPr>
-              <w:t>2</w:t>
-            </w:r>
-            <w:r>
-              <w:rPr>
-                <w:sz w:val="20"/>
-              </w:rPr>
-              <w:t>/25</w:t>
+              <w:t>15/12/25</w:t>
             </w:r>
           </w:p>
         </w:tc>
@@ -912,14 +829,16 @@
               <w:ind w:right="1"/>
               <w:rPr>
                 <w:sz w:val="20"/>
+                <w:u w:val="single"/>
               </w:rPr>
             </w:pPr>
             <w:r>
               <w:rPr>
                 <w:spacing w:val="-4"/>
                 <w:sz w:val="20"/>
-              </w:rPr>
-              <w:t>UTO1</w:t>
+                <w:u w:val="single"/>
+              </w:rPr>
+              <w:t>UTO2</w:t>
             </w:r>
           </w:p>
         </w:tc>
@@ -939,31 +858,7 @@
               <w:rPr>
                 <w:sz w:val="20"/>
               </w:rPr>
-              <w:t>04</w:t>
-            </w:r>
-            <w:r>
-              <w:rPr>
-                <w:sz w:val="20"/>
-              </w:rPr>
-              <w:t>/</w:t>
-            </w:r>
-            <w:r>
-              <w:rPr>
-                <w:sz w:val="20"/>
-              </w:rPr>
-              <w:t>01</w:t>
-            </w:r>
-            <w:r>
-              <w:rPr>
-                <w:sz w:val="20"/>
-              </w:rPr>
-              <w:t>/2</w:t>
-            </w:r>
-            <w:r>
-              <w:rPr>
-                <w:sz w:val="20"/>
-              </w:rPr>
-              <w:t>6</w:t>
+              <w:t>04/01/26</w:t>
             </w:r>
           </w:p>
         </w:tc>
@@ -1034,14 +929,16 @@
               <w:rPr>
                 <w:spacing w:val="-4"/>
                 <w:sz w:val="20"/>
+                <w:u w:val="single"/>
               </w:rPr>
             </w:pPr>
             <w:r>
               <w:rPr>
                 <w:spacing w:val="-4"/>
                 <w:sz w:val="20"/>
-              </w:rPr>
-              <w:t>UTO1</w:t>
+                <w:u w:val="single"/>
+              </w:rPr>
+              <w:t>UTO2</w:t>
             </w:r>
           </w:p>
         </w:tc>
@@ -1063,42 +960,7 @@
                 <w:spacing w:val="-2"/>
                 <w:sz w:val="20"/>
               </w:rPr>
-              <w:t>0</w:t>
-            </w:r>
-            <w:r>
-              <w:rPr>
-                <w:spacing w:val="-2"/>
-                <w:sz w:val="20"/>
-              </w:rPr>
-              <w:t>8</w:t>
-            </w:r>
-            <w:r>
-              <w:rPr>
-                <w:spacing w:val="-2"/>
-                <w:sz w:val="20"/>
-              </w:rPr>
-              <w:t>/</w:t>
-            </w:r>
-            <w:r>
-              <w:rPr>
-                <w:spacing w:val="-2"/>
-                <w:sz w:val="20"/>
-              </w:rPr>
-              <w:t>01</w:t>
-            </w:r>
-            <w:r>
-              <w:rPr>
-                <w:spacing w:val="-2"/>
-                <w:sz w:val="20"/>
-              </w:rPr>
-              <w:t>/2</w:t>
-            </w:r>
-            <w:r>
-              <w:rPr>
-                <w:spacing w:val="-2"/>
-                <w:sz w:val="20"/>
-              </w:rPr>
-              <w:t>6</w:t>
+              <w:t>08/01/26</w:t>
             </w:r>
           </w:p>
         </w:tc>

</xml_diff>